<commit_message>
for updating all the work
</commit_message>
<xml_diff>
--- a/dvproject/Documentation.docx
+++ b/dvproject/Documentation.docx
@@ -161,51 +161,15 @@
           <w:i w:val="0"/>
           <w:iCs w:val="0"/>
         </w:rPr>
-        <w:t xml:space="preserve">This field </w:t>
-      </w:r>
-      <w:proofErr w:type="gramStart"/>
-      <w:r>
-        <w:rPr>
-          <w:rStyle w:val="IntenseEmphasis"/>
-          <w:i w:val="0"/>
-          <w:iCs w:val="0"/>
-        </w:rPr>
-        <w:t>is contains</w:t>
-      </w:r>
-      <w:proofErr w:type="gramEnd"/>
-      <w:r>
-        <w:rPr>
-          <w:rStyle w:val="IntenseEmphasis"/>
-          <w:i w:val="0"/>
-          <w:iCs w:val="0"/>
-        </w:rPr>
-        <w:t xml:space="preserve"> numeric data, with the information of the </w:t>
-      </w:r>
-      <w:r>
-        <w:rPr>
-          <w:rStyle w:val="IntenseEmphasis"/>
-          <w:i w:val="0"/>
-          <w:iCs w:val="0"/>
-        </w:rPr>
-        <w:t>of number of ‘</w:t>
-      </w:r>
-      <w:proofErr w:type="spellStart"/>
-      <w:r>
-        <w:rPr>
-          <w:rStyle w:val="IntenseEmphasis"/>
-          <w:i w:val="0"/>
-          <w:iCs w:val="0"/>
-        </w:rPr>
-        <w:t>abadi</w:t>
-      </w:r>
-      <w:proofErr w:type="spellEnd"/>
-      <w:r>
-        <w:rPr>
-          <w:rStyle w:val="IntenseEmphasis"/>
-          <w:i w:val="0"/>
-          <w:iCs w:val="0"/>
-        </w:rPr>
-        <w:t xml:space="preserve"> numbers’ within the administrative unit (mouza).</w:t>
+        <w:t xml:space="preserve">This field is contains numeric data, with the information of the </w:t>
+      </w:r>
+      <w:r>
+        <w:rPr>
+          <w:rStyle w:val="IntenseEmphasis"/>
+          <w:i w:val="0"/>
+          <w:iCs w:val="0"/>
+        </w:rPr>
+        <w:t>of number of ‘abadi numbers’ within the administrative unit (mouza).</w:t>
       </w:r>
       <w:r>
         <w:rPr>
@@ -214,61 +178,7 @@
           <w:iCs w:val="0"/>
         </w:rPr>
         <w:br/>
-        <w:t xml:space="preserve">For missing values, it was taken as there is no </w:t>
-      </w:r>
-      <w:proofErr w:type="spellStart"/>
-      <w:r>
-        <w:rPr>
-          <w:rStyle w:val="IntenseEmphasis"/>
-          <w:i w:val="0"/>
-          <w:iCs w:val="0"/>
-        </w:rPr>
-        <w:t>abadi</w:t>
-      </w:r>
-      <w:proofErr w:type="spellEnd"/>
-      <w:r>
-        <w:rPr>
-          <w:rStyle w:val="IntenseEmphasis"/>
-          <w:i w:val="0"/>
-          <w:iCs w:val="0"/>
-        </w:rPr>
-        <w:t xml:space="preserve"> within that region and they will </w:t>
-      </w:r>
-      <w:proofErr w:type="gramStart"/>
-      <w:r>
-        <w:rPr>
-          <w:rStyle w:val="IntenseEmphasis"/>
-          <w:i w:val="0"/>
-          <w:iCs w:val="0"/>
-        </w:rPr>
-        <w:t>counted</w:t>
-      </w:r>
-      <w:proofErr w:type="gramEnd"/>
-      <w:r>
-        <w:rPr>
-          <w:rStyle w:val="IntenseEmphasis"/>
-          <w:i w:val="0"/>
-          <w:iCs w:val="0"/>
-        </w:rPr>
-        <w:t xml:space="preserve"> to </w:t>
-      </w:r>
-      <w:proofErr w:type="spellStart"/>
-      <w:r>
-        <w:rPr>
-          <w:rStyle w:val="IntenseEmphasis"/>
-          <w:i w:val="0"/>
-          <w:iCs w:val="0"/>
-        </w:rPr>
-        <w:t>NaN</w:t>
-      </w:r>
-      <w:proofErr w:type="spellEnd"/>
-      <w:r>
-        <w:rPr>
-          <w:rStyle w:val="IntenseEmphasis"/>
-          <w:i w:val="0"/>
-          <w:iCs w:val="0"/>
-        </w:rPr>
-        <w:t>. (no settlement)</w:t>
+        <w:t>For missing values, it was taken as there is no abadi within that region and they will counted to NaN. (no settlement)</w:t>
       </w:r>
     </w:p>
     <w:p>
@@ -365,25 +275,7 @@
           <w:i w:val="0"/>
           <w:iCs w:val="0"/>
         </w:rPr>
-        <w:t xml:space="preserve">Calculating the statistical measures, we get an average number of settlements within records of 51371 count, there are 3.3 approx. To 3 settlements. Majority of mouza’s have 4 settlements or more while the 25% has 1 or less settlements in </w:t>
-      </w:r>
-      <w:proofErr w:type="gramStart"/>
-      <w:r>
-        <w:rPr>
-          <w:rStyle w:val="IntenseEmphasis"/>
-          <w:i w:val="0"/>
-          <w:iCs w:val="0"/>
-        </w:rPr>
-        <w:t>there</w:t>
-      </w:r>
-      <w:proofErr w:type="gramEnd"/>
-      <w:r>
-        <w:rPr>
-          <w:rStyle w:val="IntenseEmphasis"/>
-          <w:i w:val="0"/>
-          <w:iCs w:val="0"/>
-        </w:rPr>
-        <w:t xml:space="preserve"> region. </w:t>
+        <w:t xml:space="preserve">Calculating the statistical measures, we get an average number of settlements within records of 51371 count, there are 3.3 approx. To 3 settlements. Majority of mouza’s have 4 settlements or more while the 25% has 1 or less settlements in there region. </w:t>
       </w:r>
     </w:p>
     <w:p>
@@ -482,21 +374,7 @@
         <w:rPr>
           <w:rStyle w:val="IntenseEmphasis"/>
         </w:rPr>
-        <w:t xml:space="preserve">What’s the </w:t>
-      </w:r>
-      <w:proofErr w:type="gramStart"/>
-      <w:r>
-        <w:rPr>
-          <w:rStyle w:val="IntenseEmphasis"/>
-        </w:rPr>
-        <w:t>problem ?</w:t>
-      </w:r>
-      <w:proofErr w:type="gramEnd"/>
-      <w:r>
-        <w:rPr>
-          <w:rStyle w:val="IntenseEmphasis"/>
-        </w:rPr>
-        <w:t xml:space="preserve"> </w:t>
+        <w:t xml:space="preserve">What’s the problem ? </w:t>
       </w:r>
     </w:p>
     <w:p>
@@ -514,25 +392,7 @@
           <w:i w:val="0"/>
           <w:iCs w:val="0"/>
         </w:rPr>
-        <w:t xml:space="preserve">There are inconsistencies in the values of the data so that, multiple representations of the same data are given. </w:t>
-      </w:r>
-      <w:proofErr w:type="spellStart"/>
-      <w:r>
-        <w:rPr>
-          <w:rStyle w:val="IntenseEmphasis"/>
-          <w:i w:val="0"/>
-          <w:iCs w:val="0"/>
-        </w:rPr>
-        <w:t>e.g</w:t>
-      </w:r>
-      <w:proofErr w:type="spellEnd"/>
-      <w:r>
-        <w:rPr>
-          <w:rStyle w:val="IntenseEmphasis"/>
-          <w:i w:val="0"/>
-          <w:iCs w:val="0"/>
-        </w:rPr>
-        <w:t xml:space="preserve"> 1,1.0,0.0, and missing values. The issue was consistent for all the columns relevant to the Agriculture and Irrigation. </w:t>
+        <w:t xml:space="preserve">There are inconsistencies in the values of the data so that, multiple representations of the same data are given. e.g 1,1.0,0.0, and missing values. The issue was consistent for all the columns relevant to the Agriculture and Irrigation. </w:t>
       </w:r>
     </w:p>
     <w:p>
@@ -550,25 +410,7 @@
           <w:i w:val="0"/>
           <w:iCs w:val="0"/>
         </w:rPr>
-        <w:t xml:space="preserve">There were columns with no records or on the questionnaire no options were selected for them. </w:t>
-      </w:r>
-      <w:proofErr w:type="gramStart"/>
-      <w:r>
-        <w:rPr>
-          <w:rStyle w:val="IntenseEmphasis"/>
-          <w:i w:val="0"/>
-          <w:iCs w:val="0"/>
-        </w:rPr>
-        <w:t>So</w:t>
-      </w:r>
-      <w:proofErr w:type="gramEnd"/>
-      <w:r>
-        <w:rPr>
-          <w:rStyle w:val="IntenseEmphasis"/>
-          <w:i w:val="0"/>
-          <w:iCs w:val="0"/>
-        </w:rPr>
-        <w:t xml:space="preserve"> there were columns with no values </w:t>
+        <w:t xml:space="preserve">There were columns with no records or on the questionnaire no options were selected for them. So there were columns with no values </w:t>
       </w:r>
       <w:r>
         <w:rPr>
@@ -946,18 +788,8 @@
           <w:i w:val="0"/>
           <w:iCs w:val="0"/>
         </w:rPr>
-        <w:t>Values were changed to {0 – to represent ‘no course improvement scheme for canals’, 1- to represent the presence of improvement scheme for canals.</w:t>
-      </w:r>
-      <w:proofErr w:type="gramStart"/>
-      <w:r>
-        <w:rPr>
-          <w:rStyle w:val="IntenseEmphasis"/>
-          <w:i w:val="0"/>
-          <w:iCs w:val="0"/>
-        </w:rPr>
-        <w:t>’ }</w:t>
-      </w:r>
-      <w:proofErr w:type="gramEnd"/>
+        <w:t>Values were changed to {0 – to represent ‘no course improvement scheme for canals’, 1- to represent the presence of improvement scheme for canals.’ }</w:t>
+      </w:r>
     </w:p>
     <w:p>
       <w:pPr>
@@ -978,25 +810,7 @@
           <w:i w:val="0"/>
           <w:iCs w:val="0"/>
         </w:rPr>
-        <w:t xml:space="preserve">Where there was no improvement scheme, the dependent variables were assigned </w:t>
-      </w:r>
-      <w:proofErr w:type="spellStart"/>
-      <w:r>
-        <w:rPr>
-          <w:rStyle w:val="IntenseEmphasis"/>
-          <w:i w:val="0"/>
-          <w:iCs w:val="0"/>
-        </w:rPr>
-        <w:t>NaN</w:t>
-      </w:r>
-      <w:proofErr w:type="spellEnd"/>
-      <w:r>
-        <w:rPr>
-          <w:rStyle w:val="IntenseEmphasis"/>
-          <w:i w:val="0"/>
-          <w:iCs w:val="0"/>
-        </w:rPr>
-        <w:t>.</w:t>
+        <w:t>Where there was no improvement scheme, the dependent variables were assigned NaN.</w:t>
       </w:r>
     </w:p>
     <w:p>
@@ -1224,16 +1038,7 @@
           <w:iCs w:val="0"/>
         </w:rPr>
         <w:tab/>
-        <w:t xml:space="preserve">Data is formatted </w:t>
-      </w:r>
-      <w:proofErr w:type="gramStart"/>
-      <w:r>
-        <w:rPr>
-          <w:rStyle w:val="IntenseEmphasis"/>
-          <w:i w:val="0"/>
-          <w:iCs w:val="0"/>
-        </w:rPr>
-        <w:t xml:space="preserve">into </w:t>
+        <w:t xml:space="preserve">Data is formatted into </w:t>
       </w:r>
       <w:r>
         <w:rPr>
@@ -1249,34 +1054,7 @@
           <w:i w:val="0"/>
           <w:iCs w:val="0"/>
         </w:rPr>
-        <w:t>3</w:t>
-      </w:r>
-      <w:proofErr w:type="gramEnd"/>
-      <w:r>
-        <w:rPr>
-          <w:rStyle w:val="IntenseEmphasis"/>
-          <w:i w:val="0"/>
-          <w:iCs w:val="0"/>
-        </w:rPr>
-        <w:t xml:space="preserve"> separate columns, for keeping a separate column to record the absence of the modern technology of irrigation. This not only made the data visual to be easily understandable, but keeping the count and absence of record easily understandable. The mouza for which there was no recorded information, they were coded with </w:t>
-      </w:r>
-      <w:proofErr w:type="spellStart"/>
-      <w:r>
-        <w:rPr>
-          <w:rStyle w:val="IntenseEmphasis"/>
-          <w:i w:val="0"/>
-          <w:iCs w:val="0"/>
-        </w:rPr>
-        <w:t>NaN</w:t>
-      </w:r>
-      <w:proofErr w:type="spellEnd"/>
-      <w:r>
-        <w:rPr>
-          <w:rStyle w:val="IntenseEmphasis"/>
-          <w:i w:val="0"/>
-          <w:iCs w:val="0"/>
-        </w:rPr>
-        <w:t>.</w:t>
+        <w:t>3 separate columns, for keeping a separate column to record the absence of the modern technology of irrigation. This not only made the data visual to be easily understandable, but keeping the count and absence of record easily understandable. The mouza for which there was no recorded information, they were coded with NaN.</w:t>
       </w:r>
     </w:p>
     <w:p>
@@ -1410,16 +1188,7 @@
           <w:i w:val="0"/>
           <w:iCs w:val="0"/>
         </w:rPr>
-        <w:t xml:space="preserve">Column ‘AI’ values were </w:t>
-      </w:r>
-      <w:proofErr w:type="gramStart"/>
-      <w:r>
-        <w:rPr>
-          <w:rStyle w:val="IntenseEmphasis"/>
-          <w:i w:val="0"/>
-          <w:iCs w:val="0"/>
-        </w:rPr>
-        <w:t>co</w:t>
+        <w:t>Column ‘AI’ values were co</w:t>
       </w:r>
       <w:r>
         <w:rPr>
@@ -1451,16 +1220,7 @@
           <w:i w:val="0"/>
           <w:iCs w:val="0"/>
         </w:rPr>
-        <w:t>e</w:t>
-      </w:r>
-      <w:proofErr w:type="gramEnd"/>
-      <w:r>
-        <w:rPr>
-          <w:rStyle w:val="IntenseEmphasis"/>
-          <w:i w:val="0"/>
-          <w:iCs w:val="0"/>
-        </w:rPr>
-        <w:t xml:space="preserve"> to ‘Numeric’ in feet and the empty values were catered. </w:t>
+        <w:t xml:space="preserve">e to ‘Numeric’ in feet and the empty values were catered. </w:t>
       </w:r>
     </w:p>
     <w:p>
@@ -1568,25 +1328,7 @@
           <w:i w:val="0"/>
           <w:iCs w:val="0"/>
         </w:rPr>
-        <w:t>Status Type of Majority of Streets (1-Metaled, 2-Cemented/</w:t>
-      </w:r>
-      <w:proofErr w:type="spellStart"/>
-      <w:r>
-        <w:rPr>
-          <w:rStyle w:val="IntenseEmphasis"/>
-          <w:i w:val="0"/>
-          <w:iCs w:val="0"/>
-        </w:rPr>
-        <w:t>Concret</w:t>
-      </w:r>
-      <w:proofErr w:type="spellEnd"/>
-      <w:r>
-        <w:rPr>
-          <w:rStyle w:val="IntenseEmphasis"/>
-          <w:i w:val="0"/>
-          <w:iCs w:val="0"/>
-        </w:rPr>
-        <w:t>, 3-Bricked/Soling, 4-Dirt Roads)</w:t>
+        <w:t>Status Type of Majority of Streets (1-Metaled, 2-Cemented/Concret, 3-Bricked/Soling, 4-Dirt Roads)</w:t>
       </w:r>
     </w:p>
     <w:p>
@@ -1699,25 +1441,7 @@
           <w:iCs w:val="0"/>
         </w:rPr>
         <w:tab/>
-        <w:t xml:space="preserve">The categorical variable describing each variable, was coerced and standardized. The strings and occurrences of ‘0’ were considered as ‘data not recorded/found’ and then were converted to </w:t>
-      </w:r>
-      <w:proofErr w:type="spellStart"/>
-      <w:r>
-        <w:rPr>
-          <w:rStyle w:val="IntenseEmphasis"/>
-          <w:i w:val="0"/>
-          <w:iCs w:val="0"/>
-        </w:rPr>
-        <w:t>NaN</w:t>
-      </w:r>
-      <w:proofErr w:type="spellEnd"/>
-      <w:r>
-        <w:rPr>
-          <w:rStyle w:val="IntenseEmphasis"/>
-          <w:i w:val="0"/>
-          <w:iCs w:val="0"/>
-        </w:rPr>
-        <w:t xml:space="preserve">.   </w:t>
+        <w:t xml:space="preserve">The categorical variable describing each variable, was coerced and standardized. The strings and occurrences of ‘0’ were considered as ‘data not recorded/found’ and then were converted to NaN.   </w:t>
       </w:r>
     </w:p>
     <w:p>
@@ -1788,41 +1512,13 @@
           <w:iCs w:val="0"/>
         </w:rPr>
       </w:pPr>
-      <w:proofErr w:type="gramStart"/>
-      <w:r>
-        <w:rPr>
-          <w:rStyle w:val="IntenseEmphasis"/>
-          <w:i w:val="0"/>
-          <w:iCs w:val="0"/>
-        </w:rPr>
-        <w:t>Yes</w:t>
-      </w:r>
-      <w:proofErr w:type="gramEnd"/>
-      <w:r>
-        <w:rPr>
-          <w:rStyle w:val="IntenseEmphasis"/>
-          <w:i w:val="0"/>
-          <w:iCs w:val="0"/>
-        </w:rPr>
-        <w:t xml:space="preserve"> In Case of '</w:t>
-      </w:r>
-      <w:proofErr w:type="spellStart"/>
-      <w:r>
-        <w:rPr>
-          <w:rStyle w:val="IntenseEmphasis"/>
-          <w:i w:val="0"/>
-          <w:iCs w:val="0"/>
-        </w:rPr>
-        <w:t>Yes'ť</w:t>
-      </w:r>
-      <w:proofErr w:type="spellEnd"/>
-      <w:r>
-        <w:rPr>
-          <w:rStyle w:val="IntenseEmphasis"/>
-          <w:i w:val="0"/>
-          <w:iCs w:val="0"/>
-        </w:rPr>
-        <w:t xml:space="preserve"> the Waste Management (1=Government, 2=Private) → Waste Management (1=Yes, 0=No)</w:t>
+      <w:r>
+        <w:rPr>
+          <w:rStyle w:val="IntenseEmphasis"/>
+          <w:i w:val="0"/>
+          <w:iCs w:val="0"/>
+        </w:rPr>
+        <w:t>Yes In Case of 'Yes'ť the Waste Management (1=Government, 2=Private) → Waste Management (1=Yes, 0=No)</w:t>
       </w:r>
     </w:p>
     <w:p>
@@ -2240,21 +1936,7 @@
         <w:rPr>
           <w:rStyle w:val="IntenseEmphasis"/>
         </w:rPr>
-        <w:t xml:space="preserve">Binary encoding (1=present, 0=absent) + Conditional </w:t>
-      </w:r>
-      <w:proofErr w:type="spellStart"/>
-      <w:r>
-        <w:rPr>
-          <w:rStyle w:val="IntenseEmphasis"/>
-        </w:rPr>
-        <w:t>NaN</w:t>
-      </w:r>
-      <w:proofErr w:type="spellEnd"/>
-      <w:r>
-        <w:rPr>
-          <w:rStyle w:val="IntenseEmphasis"/>
-        </w:rPr>
-        <w:t xml:space="preserve"> handling</w:t>
+        <w:t>Binary encoding (1=present, 0=absent) + Conditional NaN handling</w:t>
       </w:r>
     </w:p>
     <w:p>
@@ -2531,21 +2213,7 @@
         <w:rPr>
           <w:rStyle w:val="IntenseEmphasis"/>
         </w:rPr>
-        <w:t xml:space="preserve">Convert 0 values and empty to </w:t>
-      </w:r>
-      <w:proofErr w:type="spellStart"/>
-      <w:r>
-        <w:rPr>
-          <w:rStyle w:val="IntenseEmphasis"/>
-        </w:rPr>
-        <w:t>NaN</w:t>
-      </w:r>
-      <w:proofErr w:type="spellEnd"/>
-      <w:r>
-        <w:rPr>
-          <w:rStyle w:val="IntenseEmphasis"/>
-        </w:rPr>
-        <w:t>, keep valid categories</w:t>
+        <w:t>Convert 0 values and empty to NaN, keep valid categories</w:t>
       </w:r>
     </w:p>
     <w:p>
@@ -2891,21 +2559,7 @@
         <w:rPr>
           <w:color w:val="0F4761" w:themeColor="accent1" w:themeShade="BF"/>
         </w:rPr>
-        <w:t xml:space="preserve">The health facility variables contained a mix of header-like strings, zeros, and empty values in both the availability and distance fields, making it unclear whether a service was </w:t>
-      </w:r>
-      <w:proofErr w:type="gramStart"/>
-      <w:r>
-        <w:rPr>
-          <w:color w:val="0F4761" w:themeColor="accent1" w:themeShade="BF"/>
-        </w:rPr>
-        <w:t>actually present</w:t>
-      </w:r>
-      <w:proofErr w:type="gramEnd"/>
-      <w:r>
-        <w:rPr>
-          <w:color w:val="0F4761" w:themeColor="accent1" w:themeShade="BF"/>
-        </w:rPr>
-        <w:t xml:space="preserve"> or the data was simply not recorded. The original coding also used numeric categories where “2” meant absence, leading to confusion when </w:t>
+        <w:t xml:space="preserve">The health facility variables contained a mix of header-like strings, zeros, and empty values in both the availability and distance fields, making it unclear whether a service was actually present or the data was simply not recorded. The original coding also used numeric categories where “2” meant absence, leading to confusion when </w:t>
       </w:r>
       <w:r>
         <w:rPr>
@@ -3254,21 +2908,7 @@
         <w:rPr>
           <w:color w:val="0F4761" w:themeColor="accent1" w:themeShade="BF"/>
         </w:rPr>
-        <w:t xml:space="preserve">The playground data mixed header text, zeros, and empty strings in a way that made it unclear whether a specific sports facility </w:t>
-      </w:r>
-      <w:proofErr w:type="gramStart"/>
-      <w:r>
-        <w:rPr>
-          <w:color w:val="0F4761" w:themeColor="accent1" w:themeShade="BF"/>
-        </w:rPr>
-        <w:t>actually existed</w:t>
-      </w:r>
-      <w:proofErr w:type="gramEnd"/>
-      <w:r>
-        <w:rPr>
-          <w:color w:val="0F4761" w:themeColor="accent1" w:themeShade="BF"/>
-        </w:rPr>
-        <w:t xml:space="preserve"> or the answer was just missing. Male and female playground indicators were lumped together even though the questionnaire treats them separately. The “None” option added extra confusion: if a mouza marked “None,” other sports fields could still appear non-empty due to leftover values, making interpretation unreliable. All of this prevented you from cleanly answering a basic question: which sports facilities are genuinely available for boys and girls?</w:t>
+        <w:t>The playground data mixed header text, zeros, and empty strings in a way that made it unclear whether a specific sports facility actually existed or the answer was just missing. Male and female playground indicators were lumped together even though the questionnaire treats them separately. The “None” option added extra confusion: if a mouza marked “None,” other sports fields could still appear non-empty due to leftover values, making interpretation unreliable. All of this prevented you from cleanly answering a basic question: which sports facilities are genuinely available for boys and girls?</w:t>
       </w:r>
     </w:p>
     <w:p>
@@ -3525,25 +3165,7 @@
           <w:iCs w:val="0"/>
         </w:rPr>
         <w:tab/>
-        <w:t>Farm information was recorded in four columns, three numeric farm counts and one “None” flag, but the answers didn’t behave like a coherent system. “None” might be filled even when other farm counts were positive, missing values looked the same as real zeros, and fully blank rows were impossible to distinguish from genuine “no farms” situations. On top of that, the data isn’t supposed to allow both “None” and actual farm counts at the same time, so leaving things as-</w:t>
-      </w:r>
-      <w:proofErr w:type="gramStart"/>
-      <w:r>
-        <w:rPr>
-          <w:rStyle w:val="IntenseEmphasis"/>
-          <w:i w:val="0"/>
-          <w:iCs w:val="0"/>
-        </w:rPr>
-        <w:t>is would mislead</w:t>
-      </w:r>
-      <w:proofErr w:type="gramEnd"/>
-      <w:r>
-        <w:rPr>
-          <w:rStyle w:val="IntenseEmphasis"/>
-          <w:i w:val="0"/>
-          <w:iCs w:val="0"/>
-        </w:rPr>
-        <w:t xml:space="preserve"> any downstream analysis about agricultural activity in the mouza.</w:t>
+        <w:t>Farm information was recorded in four columns, three numeric farm counts and one “None” flag, but the answers didn’t behave like a coherent system. “None” might be filled even when other farm counts were positive, missing values looked the same as real zeros, and fully blank rows were impossible to distinguish from genuine “no farms” situations. On top of that, the data isn’t supposed to allow both “None” and actual farm counts at the same time, so leaving things as-is would mislead any downstream analysis about agricultural activity in the mouza.</w:t>
       </w:r>
     </w:p>
     <w:p>
@@ -3623,17 +3245,8 @@
           <w:i/>
           <w:iCs/>
         </w:rPr>
-        <w:t xml:space="preserve">Availability of Electricity to Inhabitants of Mouza </w:t>
-      </w:r>
-      <w:proofErr w:type="gramStart"/>
-      <w:r>
-        <w:rPr>
-          <w:i/>
-          <w:iCs/>
-        </w:rPr>
-        <w:t>1.All</w:t>
-      </w:r>
-      <w:proofErr w:type="gramEnd"/>
+        <w:t>Availability of Electricity to Inhabitants of Mouza 1.All</w:t>
+      </w:r>
     </w:p>
     <w:p>
       <w:pPr>
@@ -3850,21 +3463,7 @@
         <w:rPr>
           <w:color w:val="0F4761" w:themeColor="accent1" w:themeShade="BF"/>
         </w:rPr>
-        <w:t xml:space="preserve">Force both fields into a single consistent rule set. Convert availability to valid categories only (1–4), treat 0 as invalid and send it to </w:t>
-      </w:r>
-      <w:proofErr w:type="gramStart"/>
-      <w:r>
-        <w:rPr>
-          <w:color w:val="0F4761" w:themeColor="accent1" w:themeShade="BF"/>
-        </w:rPr>
-        <w:t>missing</w:t>
-      </w:r>
-      <w:proofErr w:type="gramEnd"/>
-      <w:r>
-        <w:rPr>
-          <w:color w:val="0F4761" w:themeColor="accent1" w:themeShade="BF"/>
-        </w:rPr>
-        <w:t>, and re-type distance numerically. If the place has electricity (1–2–3), distance is automatically zero. If it has none (4), distance stays and blanks become zero to reflect an actual positive separation. Rows that were originally empty in both fields are restored to real missing values, and both columns are renamed into clear, readable indicators.</w:t>
+        <w:t>Force both fields into a single consistent rule set. Convert availability to valid categories only (1–4), treat 0 as invalid and send it to missing, and re-type distance numerically. If the place has electricity (1–2–3), distance is automatically zero. If it has none (4), distance stays and blanks become zero to reflect an actual positive separation. Rows that were originally empty in both fields are restored to real missing values, and both columns are renamed into clear, readable indicators.</w:t>
       </w:r>
     </w:p>
     <w:p>
@@ -3927,35 +3526,7 @@
         <w:rPr>
           <w:rStyle w:val="IntenseEmphasis"/>
         </w:rPr>
-        <w:t xml:space="preserve">Alternate Sources of Electricity </w:t>
-      </w:r>
-      <w:proofErr w:type="gramStart"/>
-      <w:r>
-        <w:rPr>
-          <w:rStyle w:val="IntenseEmphasis"/>
-        </w:rPr>
-        <w:t>1.Solar</w:t>
-      </w:r>
-      <w:proofErr w:type="gramEnd"/>
-      <w:r>
-        <w:rPr>
-          <w:rStyle w:val="IntenseEmphasis"/>
-        </w:rPr>
-        <w:t xml:space="preserve"> </w:t>
-      </w:r>
-      <w:proofErr w:type="spellStart"/>
-      <w:r>
-        <w:rPr>
-          <w:rStyle w:val="IntenseEmphasis"/>
-        </w:rPr>
-        <w:t>Enery</w:t>
-      </w:r>
-      <w:proofErr w:type="spellEnd"/>
-      <w:r>
-        <w:rPr>
-          <w:rStyle w:val="IntenseEmphasis"/>
-        </w:rPr>
-        <w:t xml:space="preserve"> (typo in original)</w:t>
+        <w:t>Alternate Sources of Electricity 1.Solar Enery (typo in original)</w:t>
       </w:r>
     </w:p>
     <w:p>
@@ -3969,14 +3540,12 @@
           <w:rStyle w:val="IntenseEmphasis"/>
         </w:rPr>
       </w:pPr>
-      <w:proofErr w:type="gramStart"/>
       <w:r>
         <w:rPr>
           <w:rStyle w:val="IntenseEmphasis"/>
         </w:rPr>
         <w:t>Bio Gas</w:t>
       </w:r>
-      <w:proofErr w:type="gramEnd"/>
     </w:p>
     <w:p>
       <w:pPr>
@@ -4273,25 +3842,7 @@
           <w:i w:val="0"/>
           <w:iCs w:val="0"/>
         </w:rPr>
-        <w:t xml:space="preserve">The alternate-electricity fields were stored using different numeric codes per column, mixed with zeros and blanks that meant different things. That made it impossible to distinguish missing data from a true “no”, and rows could even show “None” together with real sources, which is logically wrong. The fix was to treat all-empty or all-zero rows as missing, convert each column into a clean binary indicator based on its expected code, and enforce mutual exclusivity between “None” and all real sources. After restoring original missing rows to </w:t>
-      </w:r>
-      <w:proofErr w:type="spellStart"/>
-      <w:r>
-        <w:rPr>
-          <w:rStyle w:val="IntenseEmphasis"/>
-          <w:i w:val="0"/>
-          <w:iCs w:val="0"/>
-        </w:rPr>
-        <w:t>NaN</w:t>
-      </w:r>
-      <w:proofErr w:type="spellEnd"/>
-      <w:r>
-        <w:rPr>
-          <w:rStyle w:val="IntenseEmphasis"/>
-          <w:i w:val="0"/>
-          <w:iCs w:val="0"/>
-        </w:rPr>
-        <w:t xml:space="preserve"> and renaming columns, the data now consistently shows exactly which alternate source is present (if any).</w:t>
+        <w:t>The alternate-electricity fields were stored using different numeric codes per column, mixed with zeros and blanks that meant different things. That made it impossible to distinguish missing data from a true “no”, and rows could even show “None” together with real sources, which is logically wrong. The fix was to treat all-empty or all-zero rows as missing, convert each column into a clean binary indicator based on its expected code, and enforce mutual exclusivity between “None” and all real sources. After restoring original missing rows to NaN and renaming columns, the data now consistently shows exactly which alternate source is present (if any).</w:t>
       </w:r>
     </w:p>
     <w:p>
@@ -4615,56 +4166,14 @@
         <w:rPr>
           <w:color w:val="0F4761" w:themeColor="accent1" w:themeShade="BF"/>
         </w:rPr>
-        <w:t xml:space="preserve">The fuel-availability answers were encoded with different numeric values per column, while zeros and blanks were </w:t>
-      </w:r>
-      <w:proofErr w:type="gramStart"/>
-      <w:r>
-        <w:rPr>
-          <w:color w:val="0F4761" w:themeColor="accent1" w:themeShade="BF"/>
-        </w:rPr>
-        <w:t>mixed together</w:t>
-      </w:r>
-      <w:proofErr w:type="gramEnd"/>
-      <w:r>
-        <w:rPr>
-          <w:color w:val="0F4761" w:themeColor="accent1" w:themeShade="BF"/>
-        </w:rPr>
-        <w:t xml:space="preserve">, so you couldn’t reliably tell whether a mouza </w:t>
-      </w:r>
-      <w:proofErr w:type="gramStart"/>
-      <w:r>
-        <w:rPr>
-          <w:color w:val="0F4761" w:themeColor="accent1" w:themeShade="BF"/>
-        </w:rPr>
-        <w:t>actually had</w:t>
-      </w:r>
-      <w:proofErr w:type="gramEnd"/>
-      <w:r>
-        <w:rPr>
-          <w:color w:val="0F4761" w:themeColor="accent1" w:themeShade="BF"/>
-        </w:rPr>
-        <w:t xml:space="preserve"> a given fuel type or the data was simply missing. Some rows had every fuel recorded as 0, which doesn’t make sense if at least one option should apply. The solution was to treat all-empty or all-zero rows as missing, convert </w:t>
+        <w:t xml:space="preserve">The fuel-availability answers were encoded with different numeric values per column, while zeros and blanks were mixed together, so you couldn’t reliably tell whether a mouza actually had a given fuel type or the data was simply missing. Some rows had every fuel recorded as 0, which doesn’t make sense if at least one option should apply. The solution was to treat all-empty or all-zero rows as missing, convert </w:t>
       </w:r>
       <w:r>
         <w:rPr>
           <w:color w:val="0F4761" w:themeColor="accent1" w:themeShade="BF"/>
         </w:rPr>
         <w:lastRenderedPageBreak/>
-        <w:t xml:space="preserve">each coded field into a clear binary indicator based on the expected code, and then restore original empty rows to </w:t>
-      </w:r>
-      <w:proofErr w:type="spellStart"/>
-      <w:r>
-        <w:rPr>
-          <w:color w:val="0F4761" w:themeColor="accent1" w:themeShade="BF"/>
-        </w:rPr>
-        <w:t>NaN</w:t>
-      </w:r>
-      <w:proofErr w:type="spellEnd"/>
-      <w:r>
-        <w:rPr>
-          <w:color w:val="0F4761" w:themeColor="accent1" w:themeShade="BF"/>
-        </w:rPr>
-        <w:t>. After renaming the columns, the dataset now cleanly shows whether a mouza uses Sui Gas, LPG, Kerosene, Wood, or Coal—without confusion from mixed codes or invalid zeros.</w:t>
+        <w:t>each coded field into a clear binary indicator based on the expected code, and then restore original empty rows to NaN. After renaming the columns, the dataset now cleanly shows whether a mouza uses Sui Gas, LPG, Kerosene, Wood, or Coal—without confusion from mixed codes or invalid zeros.</w:t>
       </w:r>
     </w:p>
     <w:p>
@@ -4935,43 +4444,7 @@
           <w:iCs/>
           <w:color w:val="0F4761" w:themeColor="accent1" w:themeShade="BF"/>
         </w:rPr>
-        <w:t xml:space="preserve">The road-facility data mixed category codes, zeros, and blank cells in a way that made it unclear whether a mouza </w:t>
-      </w:r>
-      <w:proofErr w:type="gramStart"/>
-      <w:r>
-        <w:rPr>
-          <w:i/>
-          <w:iCs/>
-          <w:color w:val="0F4761" w:themeColor="accent1" w:themeShade="BF"/>
-        </w:rPr>
-        <w:t>actually had</w:t>
-      </w:r>
-      <w:proofErr w:type="gramEnd"/>
-      <w:r>
-        <w:rPr>
-          <w:i/>
-          <w:iCs/>
-          <w:color w:val="0F4761" w:themeColor="accent1" w:themeShade="BF"/>
-        </w:rPr>
-        <w:t xml:space="preserve"> a certain road type or the information was simply missing. Some rows even had both fields equal to zero, which is not a valid description of road type or distance. The fix was to treat rows with both values empty or zero as missing, convert the numeric codes into meaningful road-type labels, and keep the distance field purely numeric. After restoring the original missing rows to </w:t>
-      </w:r>
-      <w:proofErr w:type="spellStart"/>
-      <w:r>
-        <w:rPr>
-          <w:i/>
-          <w:iCs/>
-          <w:color w:val="0F4761" w:themeColor="accent1" w:themeShade="BF"/>
-        </w:rPr>
-        <w:t>NaN</w:t>
-      </w:r>
-      <w:proofErr w:type="spellEnd"/>
-      <w:r>
-        <w:rPr>
-          <w:i/>
-          <w:iCs/>
-          <w:color w:val="0F4761" w:themeColor="accent1" w:themeShade="BF"/>
-        </w:rPr>
-        <w:t xml:space="preserve"> and renaming the columns, the dataset now clearly shows the actual road type and its length, without confusing placeholders or invalid codes.</w:t>
+        <w:t>The road-facility data mixed category codes, zeros, and blank cells in a way that made it unclear whether a mouza actually had a certain road type or the information was simply missing. Some rows even had both fields equal to zero, which is not a valid description of road type or distance. The fix was to treat rows with both values empty or zero as missing, convert the numeric codes into meaningful road-type labels, and keep the distance field purely numeric. After restoring the original missing rows to NaN and renaming the columns, the dataset now clearly shows the actual road type and its length, without confusing placeholders or invalid codes.</w:t>
       </w:r>
     </w:p>
     <w:p>
@@ -5279,43 +4752,7 @@
           <w:i w:val="0"/>
           <w:iCs w:val="0"/>
         </w:rPr>
-        <w:t xml:space="preserve">The media-source fields arrived as messy flags where any non-empty value implied “yes,” but blanks, zeros, and a “None” column all </w:t>
-      </w:r>
-      <w:proofErr w:type="gramStart"/>
-      <w:r>
-        <w:rPr>
-          <w:rStyle w:val="IntenseEmphasis"/>
-          <w:i w:val="0"/>
-          <w:iCs w:val="0"/>
-        </w:rPr>
-        <w:t>mixed together</w:t>
-      </w:r>
-      <w:proofErr w:type="gramEnd"/>
-      <w:r>
-        <w:rPr>
-          <w:rStyle w:val="IntenseEmphasis"/>
-          <w:i w:val="0"/>
-          <w:iCs w:val="0"/>
-        </w:rPr>
-        <w:t xml:space="preserve">. That made it impossible to tell whether a mouza genuinely had no media source or the data was simply missing. Rows where everything was blank also had to be handled carefully so they didn’t get turned into false zeros. The fix was to convert each column into a clean binary indicator, enforce the rule that if “None” is active all other media must be off (and vice-versa), and restore true missing rows to </w:t>
-      </w:r>
-      <w:proofErr w:type="spellStart"/>
-      <w:r>
-        <w:rPr>
-          <w:rStyle w:val="IntenseEmphasis"/>
-          <w:i w:val="0"/>
-          <w:iCs w:val="0"/>
-        </w:rPr>
-        <w:t>NaN</w:t>
-      </w:r>
-      <w:proofErr w:type="spellEnd"/>
-      <w:r>
-        <w:rPr>
-          <w:rStyle w:val="IntenseEmphasis"/>
-          <w:i w:val="0"/>
-          <w:iCs w:val="0"/>
-        </w:rPr>
-        <w:t>. After renaming, the dataset now reliably shows which media sources exist in each mouza without confusing blanks or contradictory flags.</w:t>
+        <w:t>The media-source fields arrived as messy flags where any non-empty value implied “yes,” but blanks, zeros, and a “None” column all mixed together. That made it impossible to tell whether a mouza genuinely had no media source or the data was simply missing. Rows where everything was blank also had to be handled carefully so they didn’t get turned into false zeros. The fix was to convert each column into a clean binary indicator, enforce the rule that if “None” is active all other media must be off (and vice-versa), and restore true missing rows to NaN. After renaming, the dataset now reliably shows which media sources exist in each mouza without confusing blanks or contradictory flags.</w:t>
       </w:r>
     </w:p>
     <w:p>
@@ -5400,25 +4837,7 @@
           <w:i w:val="0"/>
           <w:iCs w:val="0"/>
         </w:rPr>
-        <w:t xml:space="preserve">Second column: Distance in km (0 if present, actual distance if not present, </w:t>
-      </w:r>
-      <w:proofErr w:type="spellStart"/>
-      <w:r>
-        <w:rPr>
-          <w:rStyle w:val="IntenseEmphasis"/>
-          <w:i w:val="0"/>
-          <w:iCs w:val="0"/>
-        </w:rPr>
-        <w:t>NaN</w:t>
-      </w:r>
-      <w:proofErr w:type="spellEnd"/>
-      <w:r>
-        <w:rPr>
-          <w:rStyle w:val="IntenseEmphasis"/>
-          <w:i w:val="0"/>
-          <w:iCs w:val="0"/>
-        </w:rPr>
-        <w:t xml:space="preserve"> if no data)</w:t>
+        <w:t>Second column: Distance in km (0 if present, actual distance if not present, NaN if no data)</w:t>
       </w:r>
     </w:p>
     <w:p>
@@ -5597,35 +5016,7 @@
         <w:rPr>
           <w:color w:val="0F4761" w:themeColor="accent1" w:themeShade="BF"/>
         </w:rPr>
-        <w:t xml:space="preserve">These facility columns were coded awkwardly: “1” meant the facility existed (distance should then be zero), “2” meant it didn’t exist (but distance then contains the nearest location), and “0/blank” really meant no information at all. On top of that, stray header strings showed up in the data. This mixture made availability and distance ambiguous and sometimes logically contradictory. The fix was to strip out header artifacts, map availability into a clear binary indicator (present = 1, not present = 0, no data = </w:t>
-      </w:r>
-      <w:proofErr w:type="spellStart"/>
-      <w:r>
-        <w:rPr>
-          <w:color w:val="0F4761" w:themeColor="accent1" w:themeShade="BF"/>
-        </w:rPr>
-        <w:t>NaN</w:t>
-      </w:r>
-      <w:proofErr w:type="spellEnd"/>
-      <w:r>
-        <w:rPr>
-          <w:color w:val="0F4761" w:themeColor="accent1" w:themeShade="BF"/>
-        </w:rPr>
-        <w:t xml:space="preserve">), and apply consistent rules to distance (0 if present, actual distance if not present, otherwise </w:t>
-      </w:r>
-      <w:proofErr w:type="spellStart"/>
-      <w:r>
-        <w:rPr>
-          <w:color w:val="0F4761" w:themeColor="accent1" w:themeShade="BF"/>
-        </w:rPr>
-        <w:t>NaN</w:t>
-      </w:r>
-      <w:proofErr w:type="spellEnd"/>
-      <w:r>
-        <w:rPr>
-          <w:color w:val="0F4761" w:themeColor="accent1" w:themeShade="BF"/>
-        </w:rPr>
-        <w:t>). After renaming the columns, each facility now has a clean availability flag and a correct distance value, making the information reliable for analysis.</w:t>
+        <w:t>These facility columns were coded awkwardly: “1” meant the facility existed (distance should then be zero), “2” meant it didn’t exist (but distance then contains the nearest location), and “0/blank” really meant no information at all. On top of that, stray header strings showed up in the data. This mixture made availability and distance ambiguous and sometimes logically contradictory. The fix was to strip out header artifacts, map availability into a clear binary indicator (present = 1, not present = 0, no data = NaN), and apply consistent rules to distance (0 if present, actual distance if not present, otherwise NaN). After renaming the columns, each facility now has a clean availability flag and a correct distance value, making the information reliable for analysis.</w:t>
       </w:r>
     </w:p>
     <w:p>
@@ -6078,35 +5469,7 @@
         <w:rPr>
           <w:color w:val="0F4761" w:themeColor="accent1" w:themeShade="BF"/>
         </w:rPr>
-        <w:t xml:space="preserve">The community facility columns had inconsistent data: availability was coded as 1=present, 2=not present, and 0 or blanks meant missing data. Additionally, leftover header strings (starting with “P”, “N”, or “C”) were present in the cells, and distance values did not consistently match availability. The cleaning process removes all header noise, converts availability into a clear binary indicator (1=present, 0=not present, </w:t>
-      </w:r>
-      <w:proofErr w:type="spellStart"/>
-      <w:r>
-        <w:rPr>
-          <w:color w:val="0F4761" w:themeColor="accent1" w:themeShade="BF"/>
-        </w:rPr>
-        <w:t>NaN</w:t>
-      </w:r>
-      <w:proofErr w:type="spellEnd"/>
-      <w:r>
-        <w:rPr>
-          <w:color w:val="0F4761" w:themeColor="accent1" w:themeShade="BF"/>
-        </w:rPr>
-        <w:t xml:space="preserve">=unknown), sets distance to 0 when the facility is present, keeps actual distance when not present, and preserves </w:t>
-      </w:r>
-      <w:proofErr w:type="spellStart"/>
-      <w:r>
-        <w:rPr>
-          <w:color w:val="0F4761" w:themeColor="accent1" w:themeShade="BF"/>
-        </w:rPr>
-        <w:t>NaN</w:t>
-      </w:r>
-      <w:proofErr w:type="spellEnd"/>
-      <w:r>
-        <w:rPr>
-          <w:color w:val="0F4761" w:themeColor="accent1" w:themeShade="BF"/>
-        </w:rPr>
-        <w:t xml:space="preserve"> for missing data. After renaming, each </w:t>
+        <w:t xml:space="preserve">The community facility columns had inconsistent data: availability was coded as 1=present, 2=not present, and 0 or blanks meant missing data. Additionally, leftover header strings (starting with “P”, “N”, or “C”) were present in the cells, and distance values did not consistently match availability. The cleaning process removes all header noise, converts availability into a clear binary indicator (1=present, 0=not present, NaN=unknown), sets distance to 0 when the facility is present, keeps actual distance when not present, and preserves NaN for missing data. After renaming, each </w:t>
       </w:r>
       <w:r>
         <w:rPr>
@@ -6166,30 +5529,8 @@
         <w:rPr>
           <w:color w:val="0F4761" w:themeColor="accent1" w:themeShade="BF"/>
         </w:rPr>
-        <w:t>Main column: 1 = Yes (disaster occurred), 2→0 = No, 0/</w:t>
-      </w:r>
-      <w:proofErr w:type="spellStart"/>
-      <w:r>
-        <w:rPr>
-          <w:color w:val="0F4761" w:themeColor="accent1" w:themeShade="BF"/>
-        </w:rPr>
-        <w:t>NaN</w:t>
-      </w:r>
-      <w:proofErr w:type="spellEnd"/>
-      <w:r>
-        <w:rPr>
-          <w:color w:val="0F4761" w:themeColor="accent1" w:themeShade="BF"/>
-        </w:rPr>
-        <w:t xml:space="preserve"> → </w:t>
-      </w:r>
-      <w:proofErr w:type="spellStart"/>
-      <w:r>
-        <w:rPr>
-          <w:color w:val="0F4761" w:themeColor="accent1" w:themeShade="BF"/>
-        </w:rPr>
-        <w:t>NaN</w:t>
-      </w:r>
-      <w:proofErr w:type="spellEnd"/>
+        <w:t>Main column: 1 = Yes (disaster occurred), 2→0 = No, 0/NaN → NaN</w:t>
+      </w:r>
     </w:p>
     <w:p>
       <w:pPr>
@@ -6260,30 +5601,8 @@
         <w:rPr>
           <w:color w:val="0F4761" w:themeColor="accent1" w:themeShade="BF"/>
         </w:rPr>
-        <w:t>If disaster=</w:t>
-      </w:r>
-      <w:proofErr w:type="spellStart"/>
-      <w:r>
-        <w:rPr>
-          <w:color w:val="0F4761" w:themeColor="accent1" w:themeShade="BF"/>
-        </w:rPr>
-        <w:t>NaN</w:t>
-      </w:r>
-      <w:proofErr w:type="spellEnd"/>
-      <w:r>
-        <w:rPr>
-          <w:color w:val="0F4761" w:themeColor="accent1" w:themeShade="BF"/>
-        </w:rPr>
-        <w:t xml:space="preserve">: all types = </w:t>
-      </w:r>
-      <w:proofErr w:type="spellStart"/>
-      <w:r>
-        <w:rPr>
-          <w:color w:val="0F4761" w:themeColor="accent1" w:themeShade="BF"/>
-        </w:rPr>
-        <w:t>NaN</w:t>
-      </w:r>
-      <w:proofErr w:type="spellEnd"/>
+        <w:t>If disaster=NaN: all types = NaN</w:t>
+      </w:r>
     </w:p>
     <w:p>
       <w:pPr>
@@ -6421,62 +5740,20 @@
         <w:rPr>
           <w:color w:val="0F4761" w:themeColor="accent1" w:themeShade="BF"/>
         </w:rPr>
-        <w:t xml:space="preserve">The natural disaster columns had inconsistent and messy data: the main column and disaster type columns contained codes (1=Yes, 2=No, 0 or blank=missing) mixed with header strings (starting with “P” or “N”). Disaster type columns were not aligned with the main disaster column, so some types were left blank even when a disaster </w:t>
-      </w:r>
-      <w:proofErr w:type="gramStart"/>
-      <w:r>
-        <w:rPr>
-          <w:color w:val="0F4761" w:themeColor="accent1" w:themeShade="BF"/>
-        </w:rPr>
-        <w:t>occurred, or</w:t>
-      </w:r>
-      <w:proofErr w:type="gramEnd"/>
-      <w:r>
-        <w:rPr>
-          <w:color w:val="0F4761" w:themeColor="accent1" w:themeShade="BF"/>
-        </w:rPr>
-        <w:t xml:space="preserve"> had invalid entries when no disaster happened.</w:t>
-      </w:r>
-    </w:p>
-    <w:p>
-      <w:pPr>
-        <w:rPr>
-          <w:color w:val="0F4761" w:themeColor="accent1" w:themeShade="BF"/>
-        </w:rPr>
-      </w:pPr>
-      <w:r>
-        <w:rPr>
-          <w:color w:val="0F4761" w:themeColor="accent1" w:themeShade="BF"/>
-        </w:rPr>
-        <w:t xml:space="preserve">The solution cleans the data by removing header noise, converting the main column to binary (1=disaster occurred, 0=no disaster, </w:t>
-      </w:r>
-      <w:proofErr w:type="spellStart"/>
-      <w:r>
-        <w:rPr>
-          <w:color w:val="0F4761" w:themeColor="accent1" w:themeShade="BF"/>
-        </w:rPr>
-        <w:t>NaN</w:t>
-      </w:r>
-      <w:proofErr w:type="spellEnd"/>
-      <w:r>
-        <w:rPr>
-          <w:color w:val="0F4761" w:themeColor="accent1" w:themeShade="BF"/>
-        </w:rPr>
-        <w:t xml:space="preserve">=unknown), and aligning the disaster type columns accordingly: when a disaster occurred, missing types are set to 0; when no disaster occurred, all types are 0; when no data, all are </w:t>
-      </w:r>
-      <w:proofErr w:type="spellStart"/>
-      <w:r>
-        <w:rPr>
-          <w:color w:val="0F4761" w:themeColor="accent1" w:themeShade="BF"/>
-        </w:rPr>
-        <w:t>NaN</w:t>
-      </w:r>
-      <w:proofErr w:type="spellEnd"/>
-      <w:r>
-        <w:rPr>
-          <w:color w:val="0F4761" w:themeColor="accent1" w:themeShade="BF"/>
-        </w:rPr>
-        <w:t>. This ensures all natural disaster data is consistent, interpretable, and ready for analysis.</w:t>
+        <w:t>The natural disaster columns had inconsistent and messy data: the main column and disaster type columns contained codes (1=Yes, 2=No, 0 or blank=missing) mixed with header strings (starting with “P” or “N”). Disaster type columns were not aligned with the main disaster column, so some types were left blank even when a disaster occurred, or had invalid entries when no disaster happened.</w:t>
+      </w:r>
+    </w:p>
+    <w:p>
+      <w:pPr>
+        <w:rPr>
+          <w:color w:val="0F4761" w:themeColor="accent1" w:themeShade="BF"/>
+        </w:rPr>
+      </w:pPr>
+      <w:r>
+        <w:rPr>
+          <w:color w:val="0F4761" w:themeColor="accent1" w:themeShade="BF"/>
+        </w:rPr>
+        <w:t>The solution cleans the data by removing header noise, converting the main column to binary (1=disaster occurred, 0=no disaster, NaN=unknown), and aligning the disaster type columns accordingly: when a disaster occurred, missing types are set to 0; when no disaster occurred, all types are 0; when no data, all are NaN. This ensures all natural disaster data is consistent, interpretable, and ready for analysis.</w:t>
       </w:r>
     </w:p>
     <w:p>
@@ -6577,58 +5854,30 @@
           <w:color w:val="0F4761" w:themeColor="accent1" w:themeShade="BF"/>
         </w:rPr>
       </w:pPr>
-      <w:proofErr w:type="spellStart"/>
       <w:r>
         <w:rPr>
           <w:i/>
           <w:iCs/>
           <w:color w:val="0F4761" w:themeColor="accent1" w:themeShade="BF"/>
         </w:rPr>
-        <w:t>NaN</w:t>
-      </w:r>
-      <w:proofErr w:type="spellEnd"/>
-      <w:r>
+        <w:t>NaN = No data (only when ALL sources are empty)</w:t>
+      </w:r>
+    </w:p>
+    <w:p>
+      <w:pPr>
         <w:rPr>
           <w:i/>
           <w:iCs/>
           <w:color w:val="0F4761" w:themeColor="accent1" w:themeShade="BF"/>
         </w:rPr>
-        <w:t xml:space="preserve"> = No data (only when ALL sources are empty)</w:t>
-      </w:r>
-    </w:p>
-    <w:p>
-      <w:pPr>
+      </w:pPr>
+      <w:r>
         <w:rPr>
           <w:i/>
           <w:iCs/>
           <w:color w:val="0F4761" w:themeColor="accent1" w:themeShade="BF"/>
         </w:rPr>
-      </w:pPr>
-      <w:r>
-        <w:rPr>
-          <w:i/>
-          <w:iCs/>
-          <w:color w:val="0F4761" w:themeColor="accent1" w:themeShade="BF"/>
-        </w:rPr>
-        <w:t xml:space="preserve">Group </w:t>
-      </w:r>
-      <w:proofErr w:type="spellStart"/>
-      <w:r>
-        <w:rPr>
-          <w:i/>
-          <w:iCs/>
-          <w:color w:val="0F4761" w:themeColor="accent1" w:themeShade="BF"/>
-        </w:rPr>
-        <w:t>NaN</w:t>
-      </w:r>
-      <w:proofErr w:type="spellEnd"/>
-      <w:r>
-        <w:rPr>
-          <w:i/>
-          <w:iCs/>
-          <w:color w:val="0F4761" w:themeColor="accent1" w:themeShade="BF"/>
-        </w:rPr>
-        <w:t xml:space="preserve"> rule: If any source has a value, all empty ones become 0.</w:t>
+        <w:t>Group NaN rule: If any source has a value, all empty ones become 0.</w:t>
       </w:r>
     </w:p>
     <w:p>
@@ -6763,78 +6012,22 @@
         <w:rPr>
           <w:color w:val="0F4761" w:themeColor="accent1" w:themeShade="BF"/>
         </w:rPr>
-        <w:t xml:space="preserve">The credit source columns were inconsistent and messy: they contained header strings, missing values, and numeric entries representing presence of a credit source, but not in a consistent binary format. Some rows had all columns empty or partially filled, making it hard to </w:t>
-      </w:r>
-      <w:proofErr w:type="spellStart"/>
-      <w:r>
-        <w:rPr>
-          <w:color w:val="0F4761" w:themeColor="accent1" w:themeShade="BF"/>
-        </w:rPr>
-        <w:t>analyze</w:t>
-      </w:r>
-      <w:proofErr w:type="spellEnd"/>
-      <w:r>
-        <w:rPr>
-          <w:color w:val="0F4761" w:themeColor="accent1" w:themeShade="BF"/>
-        </w:rPr>
-        <w:t xml:space="preserve"> which credit sources were </w:t>
-      </w:r>
-      <w:proofErr w:type="gramStart"/>
-      <w:r>
-        <w:rPr>
-          <w:color w:val="0F4761" w:themeColor="accent1" w:themeShade="BF"/>
-        </w:rPr>
-        <w:t>actually used</w:t>
-      </w:r>
-      <w:proofErr w:type="gramEnd"/>
-      <w:r>
-        <w:rPr>
-          <w:color w:val="0F4761" w:themeColor="accent1" w:themeShade="BF"/>
-        </w:rPr>
-        <w:t>.</w:t>
-      </w:r>
-    </w:p>
-    <w:p>
-      <w:pPr>
-        <w:rPr>
-          <w:rStyle w:val="IntenseEmphasis"/>
-          <w:i w:val="0"/>
-          <w:iCs w:val="0"/>
-        </w:rPr>
-      </w:pPr>
-      <w:r>
-        <w:rPr>
-          <w:color w:val="0F4761" w:themeColor="accent1" w:themeShade="BF"/>
-        </w:rPr>
-        <w:t xml:space="preserve">The solution removes header noise, converts all numeric entries to binary (1=credit source used, 0=not used), and ensures consistency across rows. For rows where at least one credit source is present, any remaining </w:t>
-      </w:r>
-      <w:proofErr w:type="spellStart"/>
-      <w:r>
-        <w:rPr>
-          <w:color w:val="0F4761" w:themeColor="accent1" w:themeShade="BF"/>
-        </w:rPr>
-        <w:t>NaNs</w:t>
-      </w:r>
-      <w:proofErr w:type="spellEnd"/>
-      <w:r>
-        <w:rPr>
-          <w:color w:val="0F4761" w:themeColor="accent1" w:themeShade="BF"/>
-        </w:rPr>
-        <w:t xml:space="preserve"> are filled with 0 to indicate absence. Rows where all columns were originally empty are left as </w:t>
-      </w:r>
-      <w:proofErr w:type="spellStart"/>
-      <w:r>
-        <w:rPr>
-          <w:color w:val="0F4761" w:themeColor="accent1" w:themeShade="BF"/>
-        </w:rPr>
-        <w:t>NaN</w:t>
-      </w:r>
-      <w:proofErr w:type="spellEnd"/>
-      <w:r>
-        <w:rPr>
-          <w:color w:val="0F4761" w:themeColor="accent1" w:themeShade="BF"/>
-        </w:rPr>
-        <w:t>. This results in clean, interpretable binary columns for all nine credit sources, ready for analysis.</w:t>
+        <w:t>The credit source columns were inconsistent and messy: they contained header strings, missing values, and numeric entries representing presence of a credit source, but not in a consistent binary format. Some rows had all columns empty or partially filled, making it hard to analyze which credit sources were actually used.</w:t>
+      </w:r>
+    </w:p>
+    <w:p>
+      <w:pPr>
+        <w:rPr>
+          <w:rStyle w:val="IntenseEmphasis"/>
+          <w:i w:val="0"/>
+          <w:iCs w:val="0"/>
+        </w:rPr>
+      </w:pPr>
+      <w:r>
+        <w:rPr>
+          <w:color w:val="0F4761" w:themeColor="accent1" w:themeShade="BF"/>
+        </w:rPr>
+        <w:t>The solution removes header noise, converts all numeric entries to binary (1=credit source used, 0=not used), and ensures consistency across rows. For rows where at least one credit source is present, any remaining NaNs are filled with 0 to indicate absence. Rows where all columns were originally empty are left as NaN. This results in clean, interpretable binary columns for all nine credit sources, ready for analysis.</w:t>
       </w:r>
     </w:p>
     <w:p>
@@ -6996,62 +6189,20 @@
         <w:rPr>
           <w:color w:val="0F4761" w:themeColor="accent1" w:themeShade="BF"/>
         </w:rPr>
-        <w:t xml:space="preserve">The additional facility columns were messy and inconsistent, containing header strings, missing values, and numeric codes (1=present, 2=not present, 0 or </w:t>
-      </w:r>
-      <w:proofErr w:type="spellStart"/>
-      <w:r>
-        <w:rPr>
-          <w:color w:val="0F4761" w:themeColor="accent1" w:themeShade="BF"/>
-        </w:rPr>
-        <w:t>NaN</w:t>
-      </w:r>
-      <w:proofErr w:type="spellEnd"/>
-      <w:r>
-        <w:rPr>
-          <w:color w:val="0F4761" w:themeColor="accent1" w:themeShade="BF"/>
-        </w:rPr>
-        <w:t>=no data) for both availability and distance. This made it unclear which facilities were truly present and how far they were.</w:t>
-      </w:r>
-    </w:p>
-    <w:p>
-      <w:pPr>
-        <w:rPr>
-          <w:color w:val="0F4761" w:themeColor="accent1" w:themeShade="BF"/>
-        </w:rPr>
-      </w:pPr>
-      <w:r>
-        <w:rPr>
-          <w:color w:val="0F4761" w:themeColor="accent1" w:themeShade="BF"/>
-        </w:rPr>
-        <w:t xml:space="preserve">The solution cleans these columns by removing header noise, converting availability to binary (1=present, 0=not present, </w:t>
-      </w:r>
-      <w:proofErr w:type="spellStart"/>
-      <w:r>
-        <w:rPr>
-          <w:color w:val="0F4761" w:themeColor="accent1" w:themeShade="BF"/>
-        </w:rPr>
-        <w:t>NaN</w:t>
-      </w:r>
-      <w:proofErr w:type="spellEnd"/>
-      <w:r>
-        <w:rPr>
-          <w:color w:val="0F4761" w:themeColor="accent1" w:themeShade="BF"/>
-        </w:rPr>
-        <w:t xml:space="preserve">=no data), and setting distances to 0 when a facility is present, keeping valid distances when not present, and </w:t>
-      </w:r>
-      <w:proofErr w:type="spellStart"/>
-      <w:r>
-        <w:rPr>
-          <w:color w:val="0F4761" w:themeColor="accent1" w:themeShade="BF"/>
-        </w:rPr>
-        <w:t>NaN</w:t>
-      </w:r>
-      <w:proofErr w:type="spellEnd"/>
-      <w:r>
-        <w:rPr>
-          <w:color w:val="0F4761" w:themeColor="accent1" w:themeShade="BF"/>
-        </w:rPr>
-        <w:t xml:space="preserve"> when no data exists. This ensures that all four facility pairs are standardized, interpretable, and ready for analysis.</w:t>
+        <w:t>The additional facility columns were messy and inconsistent, containing header strings, missing values, and numeric codes (1=present, 2=not present, 0 or NaN=no data) for both availability and distance. This made it unclear which facilities were truly present and how far they were.</w:t>
+      </w:r>
+    </w:p>
+    <w:p>
+      <w:pPr>
+        <w:rPr>
+          <w:color w:val="0F4761" w:themeColor="accent1" w:themeShade="BF"/>
+        </w:rPr>
+      </w:pPr>
+      <w:r>
+        <w:rPr>
+          <w:color w:val="0F4761" w:themeColor="accent1" w:themeShade="BF"/>
+        </w:rPr>
+        <w:t>The solution cleans these columns by removing header noise, converting availability to binary (1=present, 0=not present, NaN=no data), and setting distances to 0 when a facility is present, keeping valid distances when not present, and NaN when no data exists. This ensures that all four facility pairs are standardized, interpretable, and ready for analysis.</w:t>
       </w:r>
     </w:p>
     <w:p>
@@ -7333,35 +6484,7 @@
         <w:rPr>
           <w:color w:val="0F4761" w:themeColor="accent1" w:themeShade="BF"/>
         </w:rPr>
-        <w:t xml:space="preserve">The solution cleans these columns by removing header noise, converting all numeric values to binary (1=present, 0=absent, </w:t>
-      </w:r>
-      <w:proofErr w:type="spellStart"/>
-      <w:r>
-        <w:rPr>
-          <w:color w:val="0F4761" w:themeColor="accent1" w:themeShade="BF"/>
-        </w:rPr>
-        <w:t>NaN</w:t>
-      </w:r>
-      <w:proofErr w:type="spellEnd"/>
-      <w:r>
-        <w:rPr>
-          <w:color w:val="0F4761" w:themeColor="accent1" w:themeShade="BF"/>
-        </w:rPr>
-        <w:t xml:space="preserve">=no data), and applying mutual exclusivity for the "None" column—if "None" is 1, all other NGO types are set to 0. Rows with all missing values are restored as </w:t>
-      </w:r>
-      <w:proofErr w:type="spellStart"/>
-      <w:r>
-        <w:rPr>
-          <w:color w:val="0F4761" w:themeColor="accent1" w:themeShade="BF"/>
-        </w:rPr>
-        <w:t>NaN</w:t>
-      </w:r>
-      <w:proofErr w:type="spellEnd"/>
-      <w:r>
-        <w:rPr>
-          <w:color w:val="0F4761" w:themeColor="accent1" w:themeShade="BF"/>
-        </w:rPr>
-        <w:t>, ensuring both male and female NGO data are standardized, interpretable, and ready for analysis.</w:t>
+        <w:t>The solution cleans these columns by removing header noise, converting all numeric values to binary (1=present, 0=absent, NaN=no data), and applying mutual exclusivity for the "None" column—if "None" is 1, all other NGO types are set to 0. Rows with all missing values are restored as NaN, ensuring both male and female NGO data are standardized, interpretable, and ready for analysis.</w:t>
       </w:r>
     </w:p>
     <w:p>
@@ -7609,25 +6732,7 @@
           <w:i w:val="0"/>
           <w:iCs w:val="0"/>
         </w:rPr>
-        <w:t xml:space="preserve">The solution cleans these columns by removing header noise, converting all positive values to binary 1 (industry present) and zeros to </w:t>
-      </w:r>
-      <w:proofErr w:type="spellStart"/>
-      <w:r>
-        <w:rPr>
-          <w:rStyle w:val="IntenseEmphasis"/>
-          <w:i w:val="0"/>
-          <w:iCs w:val="0"/>
-        </w:rPr>
-        <w:t>NaN</w:t>
-      </w:r>
-      <w:proofErr w:type="spellEnd"/>
-      <w:r>
-        <w:rPr>
-          <w:rStyle w:val="IntenseEmphasis"/>
-          <w:i w:val="0"/>
-          <w:iCs w:val="0"/>
-        </w:rPr>
-        <w:t xml:space="preserve"> (no data), and applying mutual exclusivity for the "None" column. If “None” = 1, all other industry types are set to 0, and if any industry type = 1, then “None” = 0. This ensures the data is standardized, mutually exclusive, and ready for analysis, with proper handling of missing values and verification of exclusivity rules.</w:t>
+        <w:t>The solution cleans these columns by removing header noise, converting all positive values to binary 1 (industry present) and zeros to NaN (no data), and applying mutual exclusivity for the "None" column. If “None” = 1, all other industry types are set to 0, and if any industry type = 1, then “None” = 0. This ensures the data is standardized, mutually exclusive, and ready for analysis, with proper handling of missing values and verification of exclusivity rules.</w:t>
       </w:r>
     </w:p>
     <w:p>
@@ -7939,25 +7044,7 @@
           <w:iCs/>
           <w:color w:val="0F4761" w:themeColor="accent1" w:themeShade="BF"/>
         </w:rPr>
-        <w:t xml:space="preserve">The solution cleans these columns by removing header noise, converting zeros to </w:t>
-      </w:r>
-      <w:proofErr w:type="spellStart"/>
-      <w:r>
-        <w:rPr>
-          <w:i/>
-          <w:iCs/>
-          <w:color w:val="0F4761" w:themeColor="accent1" w:themeShade="BF"/>
-        </w:rPr>
-        <w:t>NaN</w:t>
-      </w:r>
-      <w:proofErr w:type="spellEnd"/>
-      <w:r>
-        <w:rPr>
-          <w:i/>
-          <w:iCs/>
-          <w:color w:val="0F4761" w:themeColor="accent1" w:themeShade="BF"/>
-        </w:rPr>
-        <w:t xml:space="preserve"> (representing no data), mapping 3 (“None”) to 0 (not employed), and retaining 1 (Mostly) and 2 (Some) as meaningful employment indicators. This standardizes the data across all sectors, ensures clarity between “not employed” and missing data, and preserves value distributions for analysis.</w:t>
+        <w:t>The solution cleans these columns by removing header noise, converting zeros to NaN (representing no data), mapping 3 (“None”) to 0 (not employed), and retaining 1 (Mostly) and 2 (Some) as meaningful employment indicators. This standardizes the data across all sectors, ensures clarity between “not employed” and missing data, and preserves value distributions for analysis.</w:t>
       </w:r>
     </w:p>
     <w:p>
@@ -8095,16 +7182,8 @@
         <w:rPr>
           <w:color w:val="0F4761" w:themeColor="accent1" w:themeShade="BF"/>
         </w:rPr>
-        <w:t xml:space="preserve">If both empty → Keep as </w:t>
-      </w:r>
-      <w:proofErr w:type="spellStart"/>
-      <w:r>
-        <w:rPr>
-          <w:color w:val="0F4761" w:themeColor="accent1" w:themeShade="BF"/>
-        </w:rPr>
-        <w:t>NaN</w:t>
-      </w:r>
-      <w:proofErr w:type="spellEnd"/>
+        <w:t>If both empty → Keep as NaN</w:t>
+      </w:r>
     </w:p>
     <w:p>
       <w:pPr>
@@ -8291,21 +7370,7 @@
         <w:rPr>
           <w:rStyle w:val="IntenseEmphasis"/>
         </w:rPr>
-        <w:t xml:space="preserve">The PCO and Mobile Signals facility columns had inconsistent and ambiguous data: availability codes and distance values were mixed, some rows had only distances without availability, and zeros or </w:t>
-      </w:r>
-      <w:proofErr w:type="spellStart"/>
-      <w:r>
-        <w:rPr>
-          <w:rStyle w:val="IntenseEmphasis"/>
-        </w:rPr>
-        <w:t>NaNs</w:t>
-      </w:r>
-      <w:proofErr w:type="spellEnd"/>
-      <w:r>
-        <w:rPr>
-          <w:rStyle w:val="IntenseEmphasis"/>
-        </w:rPr>
-        <w:t xml:space="preserve"> were not clearly interpreted. This made it unclear whether a facility was present in the mouza, absent, or missing.</w:t>
+        <w:t>The PCO and Mobile Signals facility columns had inconsistent and ambiguous data: availability codes and distance values were mixed, some rows had only distances without availability, and zeros or NaNs were not clearly interpreted. This made it unclear whether a facility was present in the mouza, absent, or missing.</w:t>
       </w:r>
     </w:p>
     <w:p>
@@ -8343,21 +7408,7 @@
         <w:rPr>
           <w:rStyle w:val="IntenseEmphasis"/>
         </w:rPr>
-        <w:t xml:space="preserve">Treating both columns empty as </w:t>
-      </w:r>
-      <w:proofErr w:type="spellStart"/>
-      <w:r>
-        <w:rPr>
-          <w:rStyle w:val="IntenseEmphasis"/>
-        </w:rPr>
-        <w:t>NaN</w:t>
-      </w:r>
-      <w:proofErr w:type="spellEnd"/>
-      <w:r>
-        <w:rPr>
-          <w:rStyle w:val="IntenseEmphasis"/>
-        </w:rPr>
-        <w:t>.</w:t>
+        <w:t>Treating both columns empty as NaN.</w:t>
       </w:r>
     </w:p>
     <w:p>
@@ -8424,21 +7475,7 @@
         <w:rPr>
           <w:rStyle w:val="IntenseEmphasis"/>
         </w:rPr>
-        <w:t xml:space="preserve">This ensures clear, consistent encoding (1=available, 0=not available, </w:t>
-      </w:r>
-      <w:proofErr w:type="spellStart"/>
-      <w:r>
-        <w:rPr>
-          <w:rStyle w:val="IntenseEmphasis"/>
-        </w:rPr>
-        <w:t>NaN</w:t>
-      </w:r>
-      <w:proofErr w:type="spellEnd"/>
-      <w:r>
-        <w:rPr>
-          <w:rStyle w:val="IntenseEmphasis"/>
-        </w:rPr>
-        <w:t>=no data) and correct distance values, with verification to catch any inconsistencies.</w:t>
+        <w:t>This ensures clear, consistent encoding (1=available, 0=not available, NaN=no data) and correct distance values, with verification to catch any inconsistencies.</w:t>
       </w:r>
     </w:p>
     <w:p/>
@@ -8634,21 +7671,7 @@
           <w:rStyle w:val="IntenseEmphasis"/>
         </w:rPr>
         <w:lastRenderedPageBreak/>
-        <w:t xml:space="preserve">The Internet facility columns were inconsistent: availability codes and distance values were mixed, some rows had only distances without availability, and zeros or </w:t>
-      </w:r>
-      <w:proofErr w:type="spellStart"/>
-      <w:r>
-        <w:rPr>
-          <w:rStyle w:val="IntenseEmphasis"/>
-        </w:rPr>
-        <w:t>NaNs</w:t>
-      </w:r>
-      <w:proofErr w:type="spellEnd"/>
-      <w:r>
-        <w:rPr>
-          <w:rStyle w:val="IntenseEmphasis"/>
-        </w:rPr>
-        <w:t xml:space="preserve"> were not clearly interpretable. This made it unclear whether a particular Internet service (DSL, Cable, Mobile) was present in the mouza, absent, or missing.</w:t>
+        <w:t>The Internet facility columns were inconsistent: availability codes and distance values were mixed, some rows had only distances without availability, and zeros or NaNs were not clearly interpretable. This made it unclear whether a particular Internet service (DSL, Cable, Mobile) was present in the mouza, absent, or missing.</w:t>
       </w:r>
     </w:p>
     <w:p>
@@ -8679,21 +7702,7 @@
         <w:rPr>
           <w:rStyle w:val="IntenseEmphasis"/>
         </w:rPr>
-        <w:t xml:space="preserve">Keeping both columns as </w:t>
-      </w:r>
-      <w:proofErr w:type="spellStart"/>
-      <w:r>
-        <w:rPr>
-          <w:rStyle w:val="IntenseEmphasis"/>
-        </w:rPr>
-        <w:t>NaN</w:t>
-      </w:r>
-      <w:proofErr w:type="spellEnd"/>
-      <w:r>
-        <w:rPr>
-          <w:rStyle w:val="IntenseEmphasis"/>
-        </w:rPr>
-        <w:t xml:space="preserve"> if originally empty.</w:t>
+        <w:t>Keeping both columns as NaN if originally empty.</w:t>
       </w:r>
     </w:p>
     <w:p>
@@ -8760,21 +7769,7 @@
         <w:rPr>
           <w:rStyle w:val="IntenseEmphasis"/>
         </w:rPr>
-        <w:t xml:space="preserve">This approach ensures consistent encoding (1=available, 0=not available, </w:t>
-      </w:r>
-      <w:proofErr w:type="spellStart"/>
-      <w:r>
-        <w:rPr>
-          <w:rStyle w:val="IntenseEmphasis"/>
-        </w:rPr>
-        <w:t>NaN</w:t>
-      </w:r>
-      <w:proofErr w:type="spellEnd"/>
-      <w:r>
-        <w:rPr>
-          <w:rStyle w:val="IntenseEmphasis"/>
-        </w:rPr>
-        <w:t>=no data) for all Internet facilities, with distances correctly aligned, and includes verification to detect any violations of the availability-distance logic.</w:t>
+        <w:t>This approach ensures consistent encoding (1=available, 0=not available, NaN=no data) for all Internet facilities, with distances correctly aligned, and includes verification to detect any violations of the availability-distance logic.</w:t>
       </w:r>
     </w:p>
     <w:p/>

</xml_diff>